<commit_message>
Figure S4: copy of the script output, legend describes the y axis
- sup_figs/Figure S4.pdf is now a copy of build_fig_s4/FigureS4.pdf,
  which has a y-axis label and the paper's layout.
- Fig S4 legend: "Relative mutation counts" instead of "Mutation
  densities", say how the counts are scaled, what the numbers above each
  panel are, and that trends are per cancer type relative to simulated
  mutations, so they can differ from the pooled bars. Split the
  semicolon-joined color sentences.

Co-Authored-By: Claude Opus 5.5 <noreply@anthropic.com>
Claude-Session: https://claude.ai/code/session_0111x1h3jFshZUUwAQBKz1Ha
</commit_message>
<xml_diff>
--- a/sup_figs/Supplementary Figure Legend.docx
+++ b/sup_figs/Supplementary Figure Legend.docx
@@ -563,7 +563,7 @@
         <w:rPr>
           <w:rFonts w:cs="Times New Roman" w:ascii="Times New Roman" w:hAnsi="Times New Roman"/>
         </w:rPr>
-        <w:t xml:space="preserve">Mutation densities of </w:t>
+        <w:t xml:space="preserve">Relative mutation counts of </w:t>
       </w:r>
       <w:r>
         <w:rPr>
@@ -575,7 +575,7 @@
         <w:rPr>
           <w:rFonts w:cs="Times New Roman" w:ascii="Times New Roman" w:hAnsi="Times New Roman"/>
         </w:rPr>
-        <w:t xml:space="preserve"> signatures per decile (y axes) are presented for early (left) to late (right) replication domains. Real mutations for signatures are shown as bars, and simulated mutations are shown as red dashed lines. As the numbers shown on top of each plot, green bars indicate signatures consistently associated with late replication timing across cancer types; yellow bars indicate signatures consistently associated with early replication timing across cancer types; purple bars indicate signatures not affected by replication timing; blue bars indicate signatures showing inconsistent trend across cancer types.</w:t>
+        <w:t xml:space="preserve"> signatures per replication-timing decile (y axes) are presented for early (left) to late (right) replication domains. Real mutations are shown as bars, and simulated mutations are shown as red dashed lines. Real and simulated counts are each scaled to their own maximum, so the y axis shows the count relative to the decile with the most mutations. The numbers above each plot are the numbers of cancer types in which the signature increases, decreases, or is flat from early to late replication. The trends are determined separately for each cancer type and relative to the simulated mutations, so they can differ from the pooled real counts shown as bars. Green bars indicate signatures consistently associated with late replication timing across cancer types. Yellow bars indicate signatures consistently associated with early replication timing across cancer types. Purple bars indicate signatures not affected by replication timing. Blue bars indicate signatures showing an inconsistent trend across cancer types.</w:t>
       </w:r>
     </w:p>
     <w:p>

</xml_diff>